<commit_message>
Add sample documents and search results for demonstration
</commit_message>
<xml_diff>
--- a/docsearch_results.docx
+++ b/docsearch_results.docx
@@ -36,32 +36,32 @@
     </w:p>
     <w:p>
       <w:r>
-        <w:t>Report Generated On ==&gt; 2026-03-15 12:54:00</w:t>
+        <w:t>Report Generated On ==&gt; 2026-03-15 21:06:20</w:t>
       </w:r>
     </w:p>
     <w:p>
       <w:r>
-        <w:t>Search Term(s) ==&gt; splendid, indeed (match: ALL)</w:t>
+        <w:t>Search Term(s) ==&gt; budget (match: ANY)</w:t>
       </w:r>
     </w:p>
     <w:p>
       <w:r>
-        <w:t>Hits ==&gt; 7</w:t>
+        <w:t>Hits ==&gt; 10</w:t>
       </w:r>
     </w:p>
     <w:p>
       <w:r>
-        <w:t>Search Time ==&gt; 33.50 seconds</w:t>
+        <w:t>Search Time ==&gt; 0.01 seconds</w:t>
       </w:r>
     </w:p>
     <w:p>
       <w:r>
-        <w:t>Files searched ==&gt; 106 (1822.45 MB)</w:t>
+        <w:t>Files searched ==&gt; 8 (45.16 KB)</w:t>
       </w:r>
     </w:p>
     <w:p>
       <w:r>
-        <w:t>File Types Searched ==&gt; .docx: 98, .pdf: 2, .xlsx: 2, .csv: 1, .html: 1, .odt: 1, .txt: 1</w:t>
+        <w:t>File Types Searched ==&gt; .html: 1, .csv: 1, .pdf: 1, .odt: 1, .txt: 2, .docx: 1, .xlsx: 1</w:t>
       </w:r>
     </w:p>
     <w:p>
@@ -72,30 +72,21 @@
         <w:rPr>
           <w:b/>
         </w:rPr>
-        <w:t>Document: test_file.csv, Paragraph: 1, Line: 1, Match:</w:t>
+        <w:t>Document: dashboard.html, Paragraph: 5, Line: 5, Match:</w:t>
       </w:r>
     </w:p>
     <w:p>
       <w:r>
-        <w:t xml:space="preserve">"A </w:t>
+        <w:t xml:space="preserve">"The department </w:t>
       </w:r>
       <w:r>
         <w:rPr>
           <w:highlight w:val="yellow"/>
         </w:rPr>
-        <w:t>splendid</w:t>
+        <w:t>budget</w:t>
       </w:r>
       <w:r>
-        <w:t xml:space="preserve"> test file </w:t>
-      </w:r>
-      <w:r>
-        <w:rPr>
-          <w:highlight w:val="yellow"/>
-        </w:rPr>
-        <w:t>indeed</w:t>
-      </w:r>
-      <w:r>
-        <w:t>."</w:t>
+        <w:t xml:space="preserve"> utilization rate was 92%, within acceptable range."</w:t>
       </w:r>
     </w:p>
     <w:p>
@@ -106,30 +97,21 @@
         <w:rPr>
           <w:b/>
         </w:rPr>
-        <w:t>Document: test_file.docx, Paragraph: 1, Line: 1, Match:</w:t>
+        <w:t>Document: employee_data.csv, Paragraph: 3, Line: 3, Match:</w:t>
       </w:r>
     </w:p>
     <w:p>
       <w:r>
-        <w:t xml:space="preserve">"A </w:t>
+        <w:t xml:space="preserve">"Bob Martinez, Finance, Preparing the annual </w:t>
       </w:r>
       <w:r>
         <w:rPr>
           <w:highlight w:val="yellow"/>
         </w:rPr>
-        <w:t>splendid</w:t>
+        <w:t>budget</w:t>
       </w:r>
       <w:r>
-        <w:t xml:space="preserve"> test file </w:t>
-      </w:r>
-      <w:r>
-        <w:rPr>
-          <w:highlight w:val="yellow"/>
-        </w:rPr>
-        <w:t>indeed</w:t>
-      </w:r>
-      <w:r>
-        <w:t>."</w:t>
+        <w:t xml:space="preserve"> review"</w:t>
       </w:r>
     </w:p>
     <w:p>
@@ -140,30 +122,21 @@
         <w:rPr>
           <w:b/>
         </w:rPr>
-        <w:t>Document: test_file.html, Paragraph: 1, Line: 1, Match:</w:t>
+        <w:t>Document: financial_summary.pdf, Paragraph: 1, Line: 1, Match:</w:t>
       </w:r>
     </w:p>
     <w:p>
       <w:r>
-        <w:t xml:space="preserve">"A </w:t>
+        <w:t xml:space="preserve">"Annual expenses totaled $2.4M, under the approved </w:t>
       </w:r>
       <w:r>
         <w:rPr>
           <w:highlight w:val="yellow"/>
         </w:rPr>
-        <w:t>splendid</w:t>
+        <w:t>budget</w:t>
       </w:r>
       <w:r>
-        <w:t xml:space="preserve"> test file </w:t>
-      </w:r>
-      <w:r>
-        <w:rPr>
-          <w:highlight w:val="yellow"/>
-        </w:rPr>
-        <w:t>indeed</w:t>
-      </w:r>
-      <w:r>
-        <w:t>."</w:t>
+        <w:t xml:space="preserve"> by 8%."</w:t>
       </w:r>
     </w:p>
     <w:p>
@@ -174,30 +147,21 @@
         <w:rPr>
           <w:b/>
         </w:rPr>
-        <w:t>Document: test_file.odt, Paragraph: 1, Line: 1, Match:</w:t>
+        <w:t>Document: financial_summary.pdf, Paragraph: 1, Line: 1, Match:</w:t>
       </w:r>
     </w:p>
     <w:p>
       <w:r>
-        <w:t xml:space="preserve">"A </w:t>
+        <w:t xml:space="preserve">"The revised </w:t>
       </w:r>
       <w:r>
         <w:rPr>
           <w:highlight w:val="yellow"/>
         </w:rPr>
-        <w:t>splendid</w:t>
+        <w:t>budget</w:t>
       </w:r>
       <w:r>
-        <w:t xml:space="preserve"> test file </w:t>
-      </w:r>
-      <w:r>
-        <w:rPr>
-          <w:highlight w:val="yellow"/>
-        </w:rPr>
-        <w:t>indeed</w:t>
-      </w:r>
-      <w:r>
-        <w:t>."</w:t>
+        <w:t xml:space="preserve"> framework will be presented at the board meeting."</w:t>
       </w:r>
     </w:p>
     <w:p>
@@ -208,30 +172,21 @@
         <w:rPr>
           <w:b/>
         </w:rPr>
-        <w:t>Document: test_file.pdf, Paragraph: 1, Line: 1, Match:</w:t>
+        <w:t>Document: meeting_notes.odt, Paragraph: 2, Line: 2, Match:</w:t>
       </w:r>
     </w:p>
     <w:p>
       <w:r>
-        <w:t xml:space="preserve">"A </w:t>
+        <w:t xml:space="preserve">"The committee reviewed the proposed </w:t>
       </w:r>
       <w:r>
         <w:rPr>
           <w:highlight w:val="yellow"/>
         </w:rPr>
-        <w:t>splendid</w:t>
+        <w:t>budget</w:t>
       </w:r>
       <w:r>
-        <w:t xml:space="preserve"> test file </w:t>
-      </w:r>
-      <w:r>
-        <w:rPr>
-          <w:highlight w:val="yellow"/>
-        </w:rPr>
-        <w:t>indeed</w:t>
-      </w:r>
-      <w:r>
-        <w:t>."</w:t>
+        <w:t xml:space="preserve"> for fiscal year 2027."</w:t>
       </w:r>
     </w:p>
     <w:p>
@@ -242,30 +197,21 @@
         <w:rPr>
           <w:b/>
         </w:rPr>
-        <w:t>Document: test_file.txt, Paragraph: 1, Line: 1, Match:</w:t>
+        <w:t>Document: meeting_notes.odt, Paragraph: 3, Line: 3, Match:</w:t>
       </w:r>
     </w:p>
     <w:p>
       <w:r>
-        <w:t xml:space="preserve">"A </w:t>
+        <w:t xml:space="preserve">"After discussion, the </w:t>
       </w:r>
       <w:r>
         <w:rPr>
           <w:highlight w:val="yellow"/>
         </w:rPr>
-        <w:t>splendid</w:t>
+        <w:t>budget</w:t>
       </w:r>
       <w:r>
-        <w:t xml:space="preserve"> test file </w:t>
-      </w:r>
-      <w:r>
-        <w:rPr>
-          <w:highlight w:val="yellow"/>
-        </w:rPr>
-        <w:t>indeed</w:t>
-      </w:r>
-      <w:r>
-        <w:t>."</w:t>
+        <w:t xml:space="preserve"> was approved unanimously."</w:t>
       </w:r>
     </w:p>
     <w:p>
@@ -276,30 +222,127 @@
         <w:rPr>
           <w:b/>
         </w:rPr>
-        <w:t>Document: test_file.xlsx, Paragraph: 1, Line: 1, Match:</w:t>
+        <w:t>Document: project_log.txt, Paragraph: 3, Line: 3, Match:</w:t>
       </w:r>
     </w:p>
     <w:p>
       <w:r>
-        <w:t xml:space="preserve">"A </w:t>
+        <w:t xml:space="preserve">"2026-03-01: </w:t>
       </w:r>
       <w:r>
         <w:rPr>
           <w:highlight w:val="yellow"/>
         </w:rPr>
-        <w:t>splendid</w:t>
+        <w:t>Budget</w:t>
       </w:r>
       <w:r>
-        <w:t xml:space="preserve"> test file </w:t>
+        <w:t xml:space="preserve"> review requested by finance department."</w:t>
+      </w:r>
+    </w:p>
+    <w:p>
+      <w:r/>
+    </w:p>
+    <w:p>
+      <w:r>
+        <w:rPr>
+          <w:b/>
+        </w:rPr>
+        <w:t>Document: quarterly_report.docx, Paragraph: 1, Line: 1, Match:</w:t>
+      </w:r>
+    </w:p>
+    <w:p>
+      <w:r>
+        <w:t xml:space="preserve">"The Q1 </w:t>
       </w:r>
       <w:r>
         <w:rPr>
           <w:highlight w:val="yellow"/>
         </w:rPr>
-        <w:t>indeed</w:t>
+        <w:t>budget</w:t>
       </w:r>
       <w:r>
-        <w:t>."</w:t>
+        <w:t xml:space="preserve"> allocation exceeded initial projections by 12%. Revenue from</w:t>
+      </w:r>
+    </w:p>
+    <w:p>
+      <w:r>
+        <w:t xml:space="preserve">the northeast region contributed significantly to the overall </w:t>
+      </w:r>
+      <w:r>
+        <w:rPr>
+          <w:highlight w:val="yellow"/>
+        </w:rPr>
+        <w:t>budget</w:t>
+      </w:r>
+      <w:r/>
+    </w:p>
+    <w:p>
+      <w:r>
+        <w:t xml:space="preserve">surplus. Management recommends reallocating the remaining </w:t>
+      </w:r>
+      <w:r>
+        <w:rPr>
+          <w:highlight w:val="yellow"/>
+        </w:rPr>
+        <w:t>budget</w:t>
+      </w:r>
+      <w:r>
+        <w:t xml:space="preserve"> to R&amp;D</w:t>
+      </w:r>
+    </w:p>
+    <w:p>
+      <w:r>
+        <w:t>initiatives."</w:t>
+      </w:r>
+    </w:p>
+    <w:p>
+      <w:r/>
+    </w:p>
+    <w:p>
+      <w:r>
+        <w:rPr>
+          <w:b/>
+        </w:rPr>
+        <w:t>Document: sales_data.xlsx, Paragraph: 3, Line: 3, Match:</w:t>
+      </w:r>
+    </w:p>
+    <w:p>
+      <w:r>
+        <w:t xml:space="preserve">"Southeast, 800000, 900000, Under </w:t>
+      </w:r>
+      <w:r>
+        <w:rPr>
+          <w:highlight w:val="yellow"/>
+        </w:rPr>
+        <w:t>budget</w:t>
+      </w:r>
+      <w:r>
+        <w:t xml:space="preserve"> allocation"</w:t>
+      </w:r>
+    </w:p>
+    <w:p>
+      <w:r/>
+    </w:p>
+    <w:p>
+      <w:r>
+        <w:rPr>
+          <w:b/>
+        </w:rPr>
+        <w:t>Document: sales_data.xlsx, Paragraph: 5, Line: 5, Match:</w:t>
+      </w:r>
+    </w:p>
+    <w:p>
+      <w:r>
+        <w:t xml:space="preserve">"West, 1100000, 1050000, Slight </w:t>
+      </w:r>
+      <w:r>
+        <w:rPr>
+          <w:highlight w:val="yellow"/>
+        </w:rPr>
+        <w:t>budget</w:t>
+      </w:r>
+      <w:r>
+        <w:t xml:space="preserve"> surplus"</w:t>
       </w:r>
     </w:p>
     <w:p>

</xml_diff>